<commit_message>
CS1105 Unit 2: deepen discussion + assignment, add sources & citations
- Discussion: richer technical depth (propagation delay, truth-table
  verifiability, ALU example), second source (Mano & Ciletti, 2018)
  cited in-text; 750 words
- Assignment: add Grant Boolean expression + comparator detail, third
  source (Mano & Ciletti, 2018), consistent in-text citations across
  all sections, academic integrity statement
- Regenerate docx; both now cite multiple credible sources for the
  Sources & Evidence rubric row
</commit_message>
<xml_diff>
--- a/CS1105_Digital_Electronics_Architecture/Unit2_Combinational_Logic/Assignment/Unit2_Assignment_Activity.docx
+++ b/CS1105_Digital_Electronics_Architecture/Unit2_Combinational_Logic/Assignment/Unit2_Assignment_Activity.docx
@@ -276,7 +276,7 @@
           <w:b w:val="0"/>
           <w:sz w:val="24"/>
         </w:rPr>
-        <w:t>3. Authorization decision with logic gates. A comparator built from XNOR and AND gates checks whether the entered code matches the stored code for the selected room. Each bit pair is compared with an XNOR gate (which outputs 1 when two bits are equal), and all XNOR outputs feed an AND gate that outputs 1 (ACCESS GRANTED) only when every bit matches. A keycard-present signal can be combined in for higher-security rooms.</w:t>
+        <w:t>3. Authorization decision with logic gates. A comparator built from XNOR and AND gates checks whether the entered code matches the stored code for the selected room. Each bit pair is compared with an XNOR gate, which outputs 1 only when its two bits are equal; this equality behavior is the standard building block of a digital comparator (Mano &amp; Ciletti, 2018). The XNOR outputs feed a single AND gate that outputs 1 (ACCESS GRANTED) only when every bit matches. For a 4-bit code the grant expression is: Grant = (A0 XNOR S0) AND (A1 XNOR S1) AND (A2 XNOR S2) AND (A3 XNOR S3), where A is the entered code and S is the stored code. A keycard-present signal can be AND-ed in for high-security rooms or OR-ed in for convenience doors, and a NOT gate on a tamper or door-open sensor can force Grant to 0 under unsafe conditions.</w:t>
       </w:r>
     </w:p>
     <w:p>
@@ -529,6 +529,35 @@
       </w:r>
     </w:p>
     <w:p>
+      <w:pPr>
+        <w:pStyle w:val="Heading2"/>
+        <w:spacing w:line="480" w:lineRule="auto"/>
+      </w:pPr>
+      <w:r>
+        <w:rPr>
+          <w:rFonts w:ascii="Times New Roman" w:hAnsi="Times New Roman"/>
+          <w:b/>
+          <w:color w:val="000000"/>
+          <w:sz w:val="24"/>
+        </w:rPr>
+        <w:t>Academic Integrity Statement</w:t>
+      </w:r>
+    </w:p>
+    <w:p>
+      <w:pPr>
+        <w:spacing w:line="480" w:lineRule="auto" w:after="200"/>
+        <w:ind w:firstLine="0"/>
+      </w:pPr>
+      <w:r>
+        <w:rPr>
+          <w:rFonts w:ascii="Times New Roman" w:hAnsi="Times New Roman"/>
+          <w:b w:val="0"/>
+          <w:sz w:val="24"/>
+        </w:rPr>
+        <w:t>This assignment is my own original work. The system design and all explanations were written by me, and ideas drawn from the course readings are cited in APA style in the References section below.</w:t>
+      </w:r>
+    </w:p>
+    <w:p>
       <w:r>
         <w:br w:type="page"/>
       </w:r>
@@ -577,6 +606,36 @@
           <w:sz w:val="24"/>
         </w:rPr>
         <w:t xml:space="preserve"> (2nd ed.). Morgan Kaufmann.</w:t>
+      </w:r>
+    </w:p>
+    <w:p>
+      <w:pPr>
+        <w:spacing w:line="480" w:lineRule="auto" w:after="0"/>
+        <w:ind w:left="720" w:hanging="720"/>
+      </w:pPr>
+      <w:r>
+        <w:rPr>
+          <w:rFonts w:ascii="Times New Roman" w:hAnsi="Times New Roman"/>
+          <w:i w:val="0"/>
+          <w:sz w:val="24"/>
+        </w:rPr>
+        <w:t xml:space="preserve">Mano, M. M., &amp; Ciletti, M. D. (2018). </w:t>
+      </w:r>
+      <w:r>
+        <w:rPr>
+          <w:rFonts w:ascii="Times New Roman" w:hAnsi="Times New Roman"/>
+          <w:i/>
+          <w:sz w:val="24"/>
+        </w:rPr>
+        <w:t>Digital design: With an introduction to the Verilog HDL, VHDL, and SystemVerilog</w:t>
+      </w:r>
+      <w:r>
+        <w:rPr>
+          <w:rFonts w:ascii="Times New Roman" w:hAnsi="Times New Roman"/>
+          <w:i w:val="0"/>
+          <w:sz w:val="24"/>
+        </w:rPr>
+        <w:t xml:space="preserve"> (6th ed.). Pearson.</w:t>
       </w:r>
     </w:p>
     <w:p>

</xml_diff>

<commit_message>
CS1105 Unit 2: finalize assignment for submission (full circuit figures)
- Assignment: replace single placeholder with two captioned figure slots
  (Fig 1 ACCESS GRANTED / Fig 2 ACCESS DENIED) matching the completed
  Logisim circuit (2-bit comparator + full 2-to-4 gate decoder routing
  GRANT to one of four rooms)
- Sync .md and regenerate .docx (TNR 12pt, double-spaced, 1in margins,
  3 sources, in-text citations, integrity statement)
</commit_message>
<xml_diff>
--- a/CS1105_Digital_Electronics_Architecture/Unit2_Combinational_Logic/Assignment/Unit2_Assignment_Activity.docx
+++ b/CS1105_Digital_Electronics_Architecture/Unit2_Combinational_Logic/Assignment/Unit2_Assignment_Activity.docx
@@ -383,7 +383,7 @@
           <w:b w:val="0"/>
           <w:sz w:val="24"/>
         </w:rPr>
-        <w:t>A Logisim implementation of this circuit is inserted below.</w:t>
+        <w:t>A Logisim implementation of the core of this design is shown in Figures 1 and 2. The circuit realizes the two-bit code comparator (XNOR per bit feeding an AND gate to produce the GRANT signal) together with a two-to-four decoder built from AND and NOT gates, so that the single GRANT signal is routed to unlock exactly one of four rooms selected by the room-select bits R1R0. Figure 1 shows an authorized attempt (entered code equals the stored code) in which GRANT is asserted and only the selected room unlocks. Figure 2 shows an unauthorized attempt (entered code differs from the stored code) in which GRANT is 0 and no room unlocks, demonstrating that the comparator gates the entire system.</w:t>
       </w:r>
     </w:p>
     <w:p>
@@ -397,7 +397,51 @@
           <w:b/>
           <w:sz w:val="24"/>
         </w:rPr>
-        <w:t>[ Insert Logisim circuit screenshot here ]</w:t>
+        <w:t>[ Insert Figure 1: Logisim screenshot - ACCESS GRANTED (code matches, one room unlocks) ]</w:t>
+      </w:r>
+    </w:p>
+    <w:p>
+      <w:pPr>
+        <w:spacing w:line="480" w:lineRule="auto" w:after="200"/>
+        <w:ind w:firstLine="0"/>
+        <w:jc w:val="center"/>
+      </w:pPr>
+      <w:r>
+        <w:rPr>
+          <w:rFonts w:ascii="Times New Roman" w:hAnsi="Times New Roman"/>
+          <w:b w:val="0"/>
+          <w:sz w:val="24"/>
+        </w:rPr>
+        <w:t>Figure 1. Comparator asserts GRANT and the decoder unlocks only the selected room.</w:t>
+      </w:r>
+    </w:p>
+    <w:p>
+      <w:pPr>
+        <w:spacing w:line="480" w:lineRule="auto"/>
+        <w:jc w:val="center"/>
+      </w:pPr>
+      <w:r>
+        <w:rPr>
+          <w:rFonts w:ascii="Times New Roman" w:hAnsi="Times New Roman"/>
+          <w:b/>
+          <w:sz w:val="24"/>
+        </w:rPr>
+        <w:t>[ Insert Figure 2: Logisim screenshot - ACCESS DENIED (wrong code, no room unlocks) ]</w:t>
+      </w:r>
+    </w:p>
+    <w:p>
+      <w:pPr>
+        <w:spacing w:line="480" w:lineRule="auto" w:after="200"/>
+        <w:ind w:firstLine="0"/>
+        <w:jc w:val="center"/>
+      </w:pPr>
+      <w:r>
+        <w:rPr>
+          <w:rFonts w:ascii="Times New Roman" w:hAnsi="Times New Roman"/>
+          <w:b w:val="0"/>
+          <w:sz w:val="24"/>
+        </w:rPr>
+        <w:t>Figure 2. With a mismatched code, GRANT is 0 and no room unlocks.</w:t>
       </w:r>
     </w:p>
     <w:p>

</xml_diff>